<commit_message>
Rev A install sheet: plug wiring changes against the perfboard, and the label rows
The boards are proven and go into the housing next. The perfboard's J4 carried
the wall wart and HPCOOL; rev A rectifies 24 VAC on J4.1/J4.2 and has no plug
position left for HPCOOL, which moves to the J8 pigtail. The new sheet gives
the change list, the position-by-position map with the silkscreen names that
differ from the config names, the order of work with the freeze, the meter
checks before power and the proofs after, so the swap is done from one page.

The label generator's rows now describe rev A: config names on every channel
(HPCALL, DHWX, HPCOOL), both 24 VAC positions, and three pigtail rows. The MAC
is the production Pi's, which stays in the housing.

Co-Authored-By: Claude Fable 5.1 <noreply@anthropic.com>
</commit_message>
<xml_diff>
--- a/docs/PhoenixContact-BC-RPI-label.docx
+++ b/docs/PhoenixContact-BC-RPI-label.docx
@@ -198,42 +198,42 @@
                 <w:sz w:val="18"/>
                 <w:szCs w:val="18"/>
               </w:rPr>
-              <w:t xml:space="preserve">J1.4  24V COM</w:t>
-            </w:r>
-          </w:p>
-        </w:tc>
-      </w:tr>
-      <w:tr>
-        <w:tblPrEx>
-          <w:tblCellMar>
-            <w:top w:w="0" w:type="dxa"/>
-            <w:bottom w:w="0" w:type="dxa"/>
-          </w:tblCellMar>
-        </w:tblPrEx>
-        <w:trPr>
-          <w:trHeight w:val="144"/>
-        </w:trPr>
-        <w:tc>
-          <w:tcPr>
-            <w:tcW w:w="2158" w:type="dxa"/>
-            <w:gridSpan w:val="2"/>
-          </w:tcPr>
-          <w:p>
-            <w:pPr>
-              <w:tabs>
-                <w:tab w:val="right" w:pos="1980"/>
-              </w:tabs>
-              <w:rPr>
-                <w:sz w:val="18"/>
-                <w:szCs w:val="18"/>
-              </w:rPr>
-            </w:pPr>
-            <w:r>
-              <w:rPr>
-                <w:sz w:val="18"/>
-                <w:szCs w:val="18"/>
-              </w:rPr>
-              <w:t xml:space="preserve">J2.1  CHIL</w:t>
+              <w:t xml:space="preserve">J1.4  COM</w:t>
+            </w:r>
+          </w:p>
+        </w:tc>
+      </w:tr>
+      <w:tr>
+        <w:tblPrEx>
+          <w:tblCellMar>
+            <w:top w:w="0" w:type="dxa"/>
+            <w:bottom w:w="0" w:type="dxa"/>
+          </w:tblCellMar>
+        </w:tblPrEx>
+        <w:trPr>
+          <w:trHeight w:val="144"/>
+        </w:trPr>
+        <w:tc>
+          <w:tcPr>
+            <w:tcW w:w="2158" w:type="dxa"/>
+            <w:gridSpan w:val="2"/>
+          </w:tcPr>
+          <w:p>
+            <w:pPr>
+              <w:tabs>
+                <w:tab w:val="right" w:pos="1980"/>
+              </w:tabs>
+              <w:rPr>
+                <w:sz w:val="18"/>
+                <w:szCs w:val="18"/>
+              </w:rPr>
+            </w:pPr>
+            <w:r>
+              <w:rPr>
+                <w:sz w:val="18"/>
+                <w:szCs w:val="18"/>
+              </w:rPr>
+              <w:t xml:space="preserve">J2.1  HPCALL</w:t>
             </w:r>
             <w:r>
               <w:rPr>
@@ -380,7 +380,7 @@
                 <w:sz w:val="18"/>
                 <w:szCs w:val="18"/>
               </w:rPr>
-              <w:t xml:space="preserve">J2.4  24V COM</w:t>
+              <w:t xml:space="preserve">J2.4  COM</w:t>
             </w:r>
           </w:p>
         </w:tc>
@@ -562,77 +562,112 @@
                 <w:sz w:val="18"/>
                 <w:szCs w:val="18"/>
               </w:rPr>
-              <w:t xml:space="preserve">J3.4  24V COM</w:t>
-            </w:r>
-          </w:p>
-        </w:tc>
-      </w:tr>
-      <w:tr>
-        <w:tblPrEx>
-          <w:tblCellMar>
-            <w:top w:w="0" w:type="dxa"/>
-            <w:bottom w:w="0" w:type="dxa"/>
-          </w:tblCellMar>
-        </w:tblPrEx>
-        <w:trPr>
-          <w:trHeight w:val="144"/>
-        </w:trPr>
-        <w:tc>
-          <w:tcPr>
-            <w:tcW w:w="2158" w:type="dxa"/>
-            <w:gridSpan w:val="2"/>
-          </w:tcPr>
-          <w:p>
-            <w:pPr>
-              <w:tabs>
-                <w:tab w:val="right" w:pos="1980"/>
-              </w:tabs>
-              <w:rPr>
-                <w:sz w:val="18"/>
-                <w:szCs w:val="18"/>
-              </w:rPr>
-            </w:pPr>
-            <w:r>
-              <w:rPr>
-                <w:sz w:val="18"/>
-                <w:szCs w:val="18"/>
-              </w:rPr>
-              <w:t xml:space="preserve">J4.1  +14V IN</w:t>
-            </w:r>
-          </w:p>
-        </w:tc>
-      </w:tr>
-      <w:tr>
-        <w:tblPrEx>
-          <w:tblCellMar>
-            <w:top w:w="0" w:type="dxa"/>
-            <w:bottom w:w="0" w:type="dxa"/>
-          </w:tblCellMar>
-        </w:tblPrEx>
-        <w:trPr>
-          <w:trHeight w:val="144"/>
-        </w:trPr>
-        <w:tc>
-          <w:tcPr>
-            <w:tcW w:w="2158" w:type="dxa"/>
-            <w:gridSpan w:val="2"/>
-          </w:tcPr>
-          <w:p>
-            <w:pPr>
-              <w:tabs>
-                <w:tab w:val="right" w:pos="1980"/>
-              </w:tabs>
-              <w:rPr>
-                <w:sz w:val="18"/>
-                <w:szCs w:val="18"/>
-              </w:rPr>
-            </w:pPr>
-            <w:r>
-              <w:rPr>
-                <w:sz w:val="18"/>
-                <w:szCs w:val="18"/>
-              </w:rPr>
-              <w:t xml:space="preserve">J4.2  HPCOOL</w:t>
+              <w:t xml:space="preserve">J3.4  COM</w:t>
+            </w:r>
+          </w:p>
+        </w:tc>
+      </w:tr>
+      <w:tr>
+        <w:tblPrEx>
+          <w:tblCellMar>
+            <w:top w:w="0" w:type="dxa"/>
+            <w:bottom w:w="0" w:type="dxa"/>
+          </w:tblCellMar>
+        </w:tblPrEx>
+        <w:trPr>
+          <w:trHeight w:val="144"/>
+        </w:trPr>
+        <w:tc>
+          <w:tcPr>
+            <w:tcW w:w="2158" w:type="dxa"/>
+            <w:gridSpan w:val="2"/>
+          </w:tcPr>
+          <w:p>
+            <w:pPr>
+              <w:tabs>
+                <w:tab w:val="right" w:pos="1980"/>
+              </w:tabs>
+              <w:rPr>
+                <w:sz w:val="18"/>
+                <w:szCs w:val="18"/>
+              </w:rPr>
+            </w:pPr>
+            <w:r>
+              <w:rPr>
+                <w:sz w:val="18"/>
+                <w:szCs w:val="18"/>
+              </w:rPr>
+              <w:t xml:space="preserve">J4.1  24VAC IN</w:t>
+            </w:r>
+          </w:p>
+        </w:tc>
+      </w:tr>
+      <w:tr>
+        <w:tblPrEx>
+          <w:tblCellMar>
+            <w:top w:w="0" w:type="dxa"/>
+            <w:bottom w:w="0" w:type="dxa"/>
+          </w:tblCellMar>
+        </w:tblPrEx>
+        <w:trPr>
+          <w:trHeight w:val="144"/>
+        </w:trPr>
+        <w:tc>
+          <w:tcPr>
+            <w:tcW w:w="2158" w:type="dxa"/>
+            <w:gridSpan w:val="2"/>
+          </w:tcPr>
+          <w:p>
+            <w:pPr>
+              <w:tabs>
+                <w:tab w:val="right" w:pos="1980"/>
+              </w:tabs>
+              <w:rPr>
+                <w:sz w:val="18"/>
+                <w:szCs w:val="18"/>
+              </w:rPr>
+            </w:pPr>
+            <w:r>
+              <w:rPr>
+                <w:sz w:val="18"/>
+                <w:szCs w:val="18"/>
+              </w:rPr>
+              <w:t xml:space="preserve">J4.2  24VAC IN</w:t>
+            </w:r>
+          </w:p>
+        </w:tc>
+      </w:tr>
+      <w:tr>
+        <w:tblPrEx>
+          <w:tblCellMar>
+            <w:top w:w="0" w:type="dxa"/>
+            <w:bottom w:w="0" w:type="dxa"/>
+          </w:tblCellMar>
+        </w:tblPrEx>
+        <w:trPr>
+          <w:trHeight w:val="144"/>
+        </w:trPr>
+        <w:tc>
+          <w:tcPr>
+            <w:tcW w:w="2158" w:type="dxa"/>
+            <w:gridSpan w:val="2"/>
+          </w:tcPr>
+          <w:p>
+            <w:pPr>
+              <w:tabs>
+                <w:tab w:val="right" w:pos="1980"/>
+              </w:tabs>
+              <w:rPr>
+                <w:sz w:val="18"/>
+                <w:szCs w:val="18"/>
+              </w:rPr>
+            </w:pPr>
+            <w:r>
+              <w:rPr>
+                <w:sz w:val="18"/>
+                <w:szCs w:val="18"/>
+              </w:rPr>
+              <w:t xml:space="preserve">J4.3  DHWX</w:t>
             </w:r>
             <w:r>
               <w:rPr>
@@ -646,6 +681,125 @@
                 <w:sz w:val="18"/>
                 <w:szCs w:val="18"/>
               </w:rPr>
+              <w:t xml:space="preserve">(19,35)</w:t>
+            </w:r>
+          </w:p>
+        </w:tc>
+      </w:tr>
+      <w:tr>
+        <w:tblPrEx>
+          <w:tblCellMar>
+            <w:top w:w="0" w:type="dxa"/>
+            <w:bottom w:w="0" w:type="dxa"/>
+          </w:tblCellMar>
+        </w:tblPrEx>
+        <w:trPr>
+          <w:trHeight w:val="144"/>
+        </w:trPr>
+        <w:tc>
+          <w:tcPr>
+            <w:tcW w:w="2158" w:type="dxa"/>
+            <w:gridSpan w:val="2"/>
+          </w:tcPr>
+          <w:p>
+            <w:pPr>
+              <w:tabs>
+                <w:tab w:val="right" w:pos="1980"/>
+              </w:tabs>
+              <w:rPr>
+                <w:sz w:val="18"/>
+                <w:szCs w:val="18"/>
+              </w:rPr>
+            </w:pPr>
+            <w:r>
+              <w:rPr>
+                <w:sz w:val="18"/>
+                <w:szCs w:val="18"/>
+              </w:rPr>
+              <w:t xml:space="preserve">J4.4  COM</w:t>
+            </w:r>
+          </w:p>
+        </w:tc>
+      </w:tr>
+      <w:tr>
+        <w:tblPrEx>
+          <w:tblCellMar>
+            <w:top w:w="0" w:type="dxa"/>
+            <w:bottom w:w="0" w:type="dxa"/>
+          </w:tblCellMar>
+        </w:tblPrEx>
+        <w:trPr>
+          <w:trHeight w:val="144"/>
+        </w:trPr>
+        <w:tc>
+          <w:tcPr>
+            <w:tcW w:w="2158" w:type="dxa"/>
+            <w:gridSpan w:val="2"/>
+          </w:tcPr>
+          <w:p>
+            <w:pPr>
+              <w:tabs>
+                <w:tab w:val="right" w:pos="1980"/>
+              </w:tabs>
+              <w:rPr>
+                <w:sz w:val="18"/>
+                <w:szCs w:val="18"/>
+              </w:rPr>
+            </w:pPr>
+            <w:r>
+              <w:rPr>
+                <w:sz w:val="18"/>
+                <w:szCs w:val="18"/>
+              </w:rPr>
+              <w:t xml:space="preserve"> </w:t>
+            </w:r>
+          </w:p>
+        </w:tc>
+      </w:tr>
+      <w:tr>
+        <w:tblPrEx>
+          <w:tblCellMar>
+            <w:top w:w="0" w:type="dxa"/>
+            <w:bottom w:w="0" w:type="dxa"/>
+          </w:tblCellMar>
+        </w:tblPrEx>
+        <w:trPr>
+          <w:trHeight w:val="144"/>
+        </w:trPr>
+        <w:tc>
+          <w:tcPr>
+            <w:tcW w:w="2158" w:type="dxa"/>
+            <w:gridSpan w:val="2"/>
+          </w:tcPr>
+          <w:p>
+            <w:pPr>
+              <w:tabs>
+                <w:tab w:val="right" w:pos="1980"/>
+              </w:tabs>
+              <w:rPr>
+                <w:sz w:val="18"/>
+                <w:szCs w:val="18"/>
+              </w:rPr>
+            </w:pPr>
+            <w:r>
+              <w:rPr>
+                <w:sz w:val="18"/>
+                <w:szCs w:val="18"/>
+              </w:rPr>
+              <w:t xml:space="preserve">J8.1  HPCOOL  pigtail</w:t>
+            </w:r>
+            <w:r>
+              <w:rPr>
+                <w:sz w:val="18"/>
+                <w:szCs w:val="18"/>
+              </w:rPr>
+              <w:tab/>
+            </w:r>
+            <w:r>
+              <w:rPr>
+                <w:sz w:val="18"/>
+                <w:szCs w:val="18"/>
+              </w:rPr>
               <w:t xml:space="preserve">(13,33)</w:t>
             </w:r>
           </w:p>
@@ -681,7 +835,7 @@
                 <w:sz w:val="18"/>
                 <w:szCs w:val="18"/>
               </w:rPr>
-              <w:t xml:space="preserve">J4.3  SP-D</w:t>
+              <w:t xml:space="preserve">J8.2  SP-E  spare</w:t>
             </w:r>
             <w:r>
               <w:rPr>
@@ -695,42 +849,42 @@
                 <w:sz w:val="18"/>
                 <w:szCs w:val="18"/>
               </w:rPr>
-              <w:t xml:space="preserve">(19,35)</w:t>
-            </w:r>
-          </w:p>
-        </w:tc>
-      </w:tr>
-      <w:tr>
-        <w:tblPrEx>
-          <w:tblCellMar>
-            <w:top w:w="0" w:type="dxa"/>
-            <w:bottom w:w="0" w:type="dxa"/>
-          </w:tblCellMar>
-        </w:tblPrEx>
-        <w:trPr>
-          <w:trHeight w:val="144"/>
-        </w:trPr>
-        <w:tc>
-          <w:tcPr>
-            <w:tcW w:w="2158" w:type="dxa"/>
-            <w:gridSpan w:val="2"/>
-          </w:tcPr>
-          <w:p>
-            <w:pPr>
-              <w:tabs>
-                <w:tab w:val="right" w:pos="1980"/>
-              </w:tabs>
-              <w:rPr>
-                <w:sz w:val="18"/>
-                <w:szCs w:val="18"/>
-              </w:rPr>
-            </w:pPr>
-            <w:r>
-              <w:rPr>
-                <w:sz w:val="18"/>
-                <w:szCs w:val="18"/>
-              </w:rPr>
-              <w:t xml:space="preserve">J4.4  24V COM</w:t>
+              <w:t xml:space="preserve">(16,36)</w:t>
+            </w:r>
+          </w:p>
+        </w:tc>
+      </w:tr>
+      <w:tr>
+        <w:tblPrEx>
+          <w:tblCellMar>
+            <w:top w:w="0" w:type="dxa"/>
+            <w:bottom w:w="0" w:type="dxa"/>
+          </w:tblCellMar>
+        </w:tblPrEx>
+        <w:trPr>
+          <w:trHeight w:val="144"/>
+        </w:trPr>
+        <w:tc>
+          <w:tcPr>
+            <w:tcW w:w="2158" w:type="dxa"/>
+            <w:gridSpan w:val="2"/>
+          </w:tcPr>
+          <w:p>
+            <w:pPr>
+              <w:tabs>
+                <w:tab w:val="right" w:pos="1980"/>
+              </w:tabs>
+              <w:rPr>
+                <w:sz w:val="18"/>
+                <w:szCs w:val="18"/>
+              </w:rPr>
+            </w:pPr>
+            <w:r>
+              <w:rPr>
+                <w:sz w:val="18"/>
+                <w:szCs w:val="18"/>
+              </w:rPr>
+              <w:t xml:space="preserve">J8.3  COM</w:t>
             </w:r>
           </w:p>
         </w:tc>

</xml_diff>

<commit_message>
Label: drop the spacer rows and the pigtail word so the table fits the slot
Co-Authored-By: Claude Fable 5.1 <noreply@anthropic.com>
</commit_message>
<xml_diff>
--- a/docs/PhoenixContact-BC-RPI-label.docx
+++ b/docs/PhoenixContact-BC-RPI-label.docx
@@ -751,42 +751,7 @@
                 <w:sz w:val="18"/>
                 <w:szCs w:val="18"/>
               </w:rPr>
-              <w:t xml:space="preserve"> </w:t>
-            </w:r>
-          </w:p>
-        </w:tc>
-      </w:tr>
-      <w:tr>
-        <w:tblPrEx>
-          <w:tblCellMar>
-            <w:top w:w="0" w:type="dxa"/>
-            <w:bottom w:w="0" w:type="dxa"/>
-          </w:tblCellMar>
-        </w:tblPrEx>
-        <w:trPr>
-          <w:trHeight w:val="144"/>
-        </w:trPr>
-        <w:tc>
-          <w:tcPr>
-            <w:tcW w:w="2158" w:type="dxa"/>
-            <w:gridSpan w:val="2"/>
-          </w:tcPr>
-          <w:p>
-            <w:pPr>
-              <w:tabs>
-                <w:tab w:val="right" w:pos="1980"/>
-              </w:tabs>
-              <w:rPr>
-                <w:sz w:val="18"/>
-                <w:szCs w:val="18"/>
-              </w:rPr>
-            </w:pPr>
-            <w:r>
-              <w:rPr>
-                <w:sz w:val="18"/>
-                <w:szCs w:val="18"/>
-              </w:rPr>
-              <w:t xml:space="preserve">J8.1  HPCOOL  pigtail</w:t>
+              <w:t xml:space="preserve">J8.1  HPCOOL</w:t>
             </w:r>
             <w:r>
               <w:rPr>
@@ -919,41 +884,6 @@
                 <w:sz w:val="18"/>
                 <w:szCs w:val="18"/>
               </w:rPr>
-              <w:t xml:space="preserve"> </w:t>
-            </w:r>
-          </w:p>
-        </w:tc>
-      </w:tr>
-      <w:tr>
-        <w:tblPrEx>
-          <w:tblCellMar>
-            <w:top w:w="0" w:type="dxa"/>
-            <w:bottom w:w="0" w:type="dxa"/>
-          </w:tblCellMar>
-        </w:tblPrEx>
-        <w:trPr>
-          <w:trHeight w:val="144"/>
-        </w:trPr>
-        <w:tc>
-          <w:tcPr>
-            <w:tcW w:w="2158" w:type="dxa"/>
-            <w:gridSpan w:val="2"/>
-          </w:tcPr>
-          <w:p>
-            <w:pPr>
-              <w:tabs>
-                <w:tab w:val="right" w:pos="1980"/>
-              </w:tabs>
-              <w:rPr>
-                <w:sz w:val="18"/>
-                <w:szCs w:val="18"/>
-              </w:rPr>
-            </w:pPr>
-            <w:r>
-              <w:rPr>
-                <w:sz w:val="18"/>
-                <w:szCs w:val="18"/>
-              </w:rPr>
               <w:t xml:space="preserve">H1  GND·DATA·VCC  trunk</w:t>
             </w:r>
           </w:p>
@@ -1095,41 +1025,6 @@
                 <w:szCs w:val="18"/>
               </w:rPr>
               <w:t xml:space="preserve">LINK  3V3·SDA·SCL·sp·GND</w:t>
-            </w:r>
-          </w:p>
-        </w:tc>
-      </w:tr>
-      <w:tr>
-        <w:tblPrEx>
-          <w:tblCellMar>
-            <w:top w:w="0" w:type="dxa"/>
-            <w:bottom w:w="0" w:type="dxa"/>
-          </w:tblCellMar>
-        </w:tblPrEx>
-        <w:trPr>
-          <w:trHeight w:val="144"/>
-        </w:trPr>
-        <w:tc>
-          <w:tcPr>
-            <w:tcW w:w="2158" w:type="dxa"/>
-            <w:gridSpan w:val="2"/>
-          </w:tcPr>
-          <w:p>
-            <w:pPr>
-              <w:tabs>
-                <w:tab w:val="right" w:pos="1980"/>
-              </w:tabs>
-              <w:rPr>
-                <w:sz w:val="18"/>
-                <w:szCs w:val="18"/>
-              </w:rPr>
-            </w:pPr>
-            <w:r>
-              <w:rPr>
-                <w:sz w:val="18"/>
-                <w:szCs w:val="18"/>
-              </w:rPr>
-              <w:t xml:space="preserve"> </w:t>
             </w:r>
           </w:p>
         </w:tc>

</xml_diff>

<commit_message>
Label: drop the H-order row to fit the slot
The front-view pin order of the H sockets is in docs/ds18b20-bus-topology.md and
on the EXT board's own silkscreen, so the label does not need it.

Co-Authored-By: Claude Fable 5.1 <noreply@anthropic.com>
</commit_message>
<xml_diff>
--- a/docs/PhoenixContact-BC-RPI-label.docx
+++ b/docs/PhoenixContact-BC-RPI-label.docx
@@ -955,41 +955,6 @@
                 <w:szCs w:val="18"/>
               </w:rPr>
               <w:t xml:space="preserve">H3  GND·DATA·VCC  spare</w:t>
-            </w:r>
-          </w:p>
-        </w:tc>
-      </w:tr>
-      <w:tr>
-        <w:tblPrEx>
-          <w:tblCellMar>
-            <w:top w:w="0" w:type="dxa"/>
-            <w:bottom w:w="0" w:type="dxa"/>
-          </w:tblCellMar>
-        </w:tblPrEx>
-        <w:trPr>
-          <w:trHeight w:val="144"/>
-        </w:trPr>
-        <w:tc>
-          <w:tcPr>
-            <w:tcW w:w="2158" w:type="dxa"/>
-            <w:gridSpan w:val="2"/>
-          </w:tcPr>
-          <w:p>
-            <w:pPr>
-              <w:tabs>
-                <w:tab w:val="right" w:pos="1980"/>
-              </w:tabs>
-              <w:rPr>
-                <w:sz w:val="18"/>
-                <w:szCs w:val="18"/>
-              </w:rPr>
-            </w:pPr>
-            <w:r>
-              <w:rPr>
-                <w:sz w:val="18"/>
-                <w:szCs w:val="18"/>
-              </w:rPr>
-              <w:t xml:space="preserve">H order is the front view, solder side out</w:t>
             </w:r>
           </w:p>
         </w:tc>

</xml_diff>

<commit_message>
Label: one spacer between LINK and the MAC row
Co-Authored-By: Claude Fable 5.1 <noreply@anthropic.com>
</commit_message>
<xml_diff>
--- a/docs/PhoenixContact-BC-RPI-label.docx
+++ b/docs/PhoenixContact-BC-RPI-label.docx
@@ -990,6 +990,41 @@
                 <w:szCs w:val="18"/>
               </w:rPr>
               <w:t xml:space="preserve">LINK  3V3·SDA·SCL·sp·GND</w:t>
+            </w:r>
+          </w:p>
+        </w:tc>
+      </w:tr>
+      <w:tr>
+        <w:tblPrEx>
+          <w:tblCellMar>
+            <w:top w:w="0" w:type="dxa"/>
+            <w:bottom w:w="0" w:type="dxa"/>
+          </w:tblCellMar>
+        </w:tblPrEx>
+        <w:trPr>
+          <w:trHeight w:val="144"/>
+        </w:trPr>
+        <w:tc>
+          <w:tcPr>
+            <w:tcW w:w="2158" w:type="dxa"/>
+            <w:gridSpan w:val="2"/>
+          </w:tcPr>
+          <w:p>
+            <w:pPr>
+              <w:tabs>
+                <w:tab w:val="right" w:pos="1980"/>
+              </w:tabs>
+              <w:rPr>
+                <w:sz w:val="18"/>
+                <w:szCs w:val="18"/>
+              </w:rPr>
+            </w:pPr>
+            <w:r>
+              <w:rPr>
+                <w:sz w:val="18"/>
+                <w:szCs w:val="18"/>
+              </w:rPr>
+              <w:t xml:space="preserve"> </w:t>
             </w:r>
           </w:p>
         </w:tc>

</xml_diff>

<commit_message>
Label: drop the internal LINK row, spacer between the J and H blocks
Co-Authored-By: Claude Fable 5.1 <noreply@anthropic.com>
</commit_message>
<xml_diff>
--- a/docs/PhoenixContact-BC-RPI-label.docx
+++ b/docs/PhoenixContact-BC-RPI-label.docx
@@ -884,6 +884,41 @@
                 <w:sz w:val="18"/>
                 <w:szCs w:val="18"/>
               </w:rPr>
+              <w:t xml:space="preserve"> </w:t>
+            </w:r>
+          </w:p>
+        </w:tc>
+      </w:tr>
+      <w:tr>
+        <w:tblPrEx>
+          <w:tblCellMar>
+            <w:top w:w="0" w:type="dxa"/>
+            <w:bottom w:w="0" w:type="dxa"/>
+          </w:tblCellMar>
+        </w:tblPrEx>
+        <w:trPr>
+          <w:trHeight w:val="144"/>
+        </w:trPr>
+        <w:tc>
+          <w:tcPr>
+            <w:tcW w:w="2158" w:type="dxa"/>
+            <w:gridSpan w:val="2"/>
+          </w:tcPr>
+          <w:p>
+            <w:pPr>
+              <w:tabs>
+                <w:tab w:val="right" w:pos="1980"/>
+              </w:tabs>
+              <w:rPr>
+                <w:sz w:val="18"/>
+                <w:szCs w:val="18"/>
+              </w:rPr>
+            </w:pPr>
+            <w:r>
+              <w:rPr>
+                <w:sz w:val="18"/>
+                <w:szCs w:val="18"/>
+              </w:rPr>
               <w:t xml:space="preserve">H1  GND·DATA·VCC  trunk</w:t>
             </w:r>
           </w:p>
@@ -955,41 +990,6 @@
                 <w:szCs w:val="18"/>
               </w:rPr>
               <w:t xml:space="preserve">H3  GND·DATA·VCC  spare</w:t>
-            </w:r>
-          </w:p>
-        </w:tc>
-      </w:tr>
-      <w:tr>
-        <w:tblPrEx>
-          <w:tblCellMar>
-            <w:top w:w="0" w:type="dxa"/>
-            <w:bottom w:w="0" w:type="dxa"/>
-          </w:tblCellMar>
-        </w:tblPrEx>
-        <w:trPr>
-          <w:trHeight w:val="144"/>
-        </w:trPr>
-        <w:tc>
-          <w:tcPr>
-            <w:tcW w:w="2158" w:type="dxa"/>
-            <w:gridSpan w:val="2"/>
-          </w:tcPr>
-          <w:p>
-            <w:pPr>
-              <w:tabs>
-                <w:tab w:val="right" w:pos="1980"/>
-              </w:tabs>
-              <w:rPr>
-                <w:sz w:val="18"/>
-                <w:szCs w:val="18"/>
-              </w:rPr>
-            </w:pPr>
-            <w:r>
-              <w:rPr>
-                <w:sz w:val="18"/>
-                <w:szCs w:val="18"/>
-              </w:rPr>
-              <w:t xml:space="preserve">LINK  3V3·SDA·SCL·sp·GND</w:t>
             </w:r>
           </w:p>
         </w:tc>

</xml_diff>

<commit_message>
Label for the rev B INT and rev C EXT boards
J4 carries HPCOOL, DHWX and SP-E; the J8 pigtail rows go; EXT's 24 VAC entry
and 5 V output rows and the two rev C probe sockets replace the H3 row. The
MAC is unchanged: the same Pi moves onto the new boards.

Co-Authored-By: Claude Fable 5.1 <noreply@anthropic.com>
</commit_message>
<xml_diff>
--- a/docs/PhoenixContact-BC-RPI-label.docx
+++ b/docs/PhoenixContact-BC-RPI-label.docx
@@ -597,77 +597,7 @@
                 <w:sz w:val="18"/>
                 <w:szCs w:val="18"/>
               </w:rPr>
-              <w:t xml:space="preserve">J4.1  24VAC IN</w:t>
-            </w:r>
-          </w:p>
-        </w:tc>
-      </w:tr>
-      <w:tr>
-        <w:tblPrEx>
-          <w:tblCellMar>
-            <w:top w:w="0" w:type="dxa"/>
-            <w:bottom w:w="0" w:type="dxa"/>
-          </w:tblCellMar>
-        </w:tblPrEx>
-        <w:trPr>
-          <w:trHeight w:val="144"/>
-        </w:trPr>
-        <w:tc>
-          <w:tcPr>
-            <w:tcW w:w="2158" w:type="dxa"/>
-            <w:gridSpan w:val="2"/>
-          </w:tcPr>
-          <w:p>
-            <w:pPr>
-              <w:tabs>
-                <w:tab w:val="right" w:pos="1980"/>
-              </w:tabs>
-              <w:rPr>
-                <w:sz w:val="18"/>
-                <w:szCs w:val="18"/>
-              </w:rPr>
-            </w:pPr>
-            <w:r>
-              <w:rPr>
-                <w:sz w:val="18"/>
-                <w:szCs w:val="18"/>
-              </w:rPr>
-              <w:t xml:space="preserve">J4.2  24VAC IN</w:t>
-            </w:r>
-          </w:p>
-        </w:tc>
-      </w:tr>
-      <w:tr>
-        <w:tblPrEx>
-          <w:tblCellMar>
-            <w:top w:w="0" w:type="dxa"/>
-            <w:bottom w:w="0" w:type="dxa"/>
-          </w:tblCellMar>
-        </w:tblPrEx>
-        <w:trPr>
-          <w:trHeight w:val="144"/>
-        </w:trPr>
-        <w:tc>
-          <w:tcPr>
-            <w:tcW w:w="2158" w:type="dxa"/>
-            <w:gridSpan w:val="2"/>
-          </w:tcPr>
-          <w:p>
-            <w:pPr>
-              <w:tabs>
-                <w:tab w:val="right" w:pos="1980"/>
-              </w:tabs>
-              <w:rPr>
-                <w:sz w:val="18"/>
-                <w:szCs w:val="18"/>
-              </w:rPr>
-            </w:pPr>
-            <w:r>
-              <w:rPr>
-                <w:sz w:val="18"/>
-                <w:szCs w:val="18"/>
-              </w:rPr>
-              <w:t xml:space="preserve">J4.3  DHWX</w:t>
+              <w:t xml:space="preserve">J4.1  HPCOOL</w:t>
             </w:r>
             <w:r>
               <w:rPr>
@@ -681,6 +611,55 @@
                 <w:sz w:val="18"/>
                 <w:szCs w:val="18"/>
               </w:rPr>
+              <w:t xml:space="preserve">(13,33)</w:t>
+            </w:r>
+          </w:p>
+        </w:tc>
+      </w:tr>
+      <w:tr>
+        <w:tblPrEx>
+          <w:tblCellMar>
+            <w:top w:w="0" w:type="dxa"/>
+            <w:bottom w:w="0" w:type="dxa"/>
+          </w:tblCellMar>
+        </w:tblPrEx>
+        <w:trPr>
+          <w:trHeight w:val="144"/>
+        </w:trPr>
+        <w:tc>
+          <w:tcPr>
+            <w:tcW w:w="2158" w:type="dxa"/>
+            <w:gridSpan w:val="2"/>
+          </w:tcPr>
+          <w:p>
+            <w:pPr>
+              <w:tabs>
+                <w:tab w:val="right" w:pos="1980"/>
+              </w:tabs>
+              <w:rPr>
+                <w:sz w:val="18"/>
+                <w:szCs w:val="18"/>
+              </w:rPr>
+            </w:pPr>
+            <w:r>
+              <w:rPr>
+                <w:sz w:val="18"/>
+                <w:szCs w:val="18"/>
+              </w:rPr>
+              <w:t xml:space="preserve">J4.2  DHWX</w:t>
+            </w:r>
+            <w:r>
+              <w:rPr>
+                <w:sz w:val="18"/>
+                <w:szCs w:val="18"/>
+              </w:rPr>
+              <w:tab/>
+            </w:r>
+            <w:r>
+              <w:rPr>
+                <w:sz w:val="18"/>
+                <w:szCs w:val="18"/>
+              </w:rPr>
               <w:t xml:space="preserve">(19,35)</w:t>
             </w:r>
           </w:p>
@@ -716,6 +695,55 @@
                 <w:sz w:val="18"/>
                 <w:szCs w:val="18"/>
               </w:rPr>
+              <w:t xml:space="preserve">J4.3  SP-E  spare</w:t>
+            </w:r>
+            <w:r>
+              <w:rPr>
+                <w:sz w:val="18"/>
+                <w:szCs w:val="18"/>
+              </w:rPr>
+              <w:tab/>
+            </w:r>
+            <w:r>
+              <w:rPr>
+                <w:sz w:val="18"/>
+                <w:szCs w:val="18"/>
+              </w:rPr>
+              <w:t xml:space="preserve">(16,36)</w:t>
+            </w:r>
+          </w:p>
+        </w:tc>
+      </w:tr>
+      <w:tr>
+        <w:tblPrEx>
+          <w:tblCellMar>
+            <w:top w:w="0" w:type="dxa"/>
+            <w:bottom w:w="0" w:type="dxa"/>
+          </w:tblCellMar>
+        </w:tblPrEx>
+        <w:trPr>
+          <w:trHeight w:val="144"/>
+        </w:trPr>
+        <w:tc>
+          <w:tcPr>
+            <w:tcW w:w="2158" w:type="dxa"/>
+            <w:gridSpan w:val="2"/>
+          </w:tcPr>
+          <w:p>
+            <w:pPr>
+              <w:tabs>
+                <w:tab w:val="right" w:pos="1980"/>
+              </w:tabs>
+              <w:rPr>
+                <w:sz w:val="18"/>
+                <w:szCs w:val="18"/>
+              </w:rPr>
+            </w:pPr>
+            <w:r>
+              <w:rPr>
+                <w:sz w:val="18"/>
+                <w:szCs w:val="18"/>
+              </w:rPr>
               <w:t xml:space="preserve">J4.4  COM</w:t>
             </w:r>
           </w:p>
@@ -751,139 +779,6 @@
                 <w:sz w:val="18"/>
                 <w:szCs w:val="18"/>
               </w:rPr>
-              <w:t xml:space="preserve">J8.1  HPCOOL</w:t>
-            </w:r>
-            <w:r>
-              <w:rPr>
-                <w:sz w:val="18"/>
-                <w:szCs w:val="18"/>
-              </w:rPr>
-              <w:tab/>
-            </w:r>
-            <w:r>
-              <w:rPr>
-                <w:sz w:val="18"/>
-                <w:szCs w:val="18"/>
-              </w:rPr>
-              <w:t xml:space="preserve">(13,33)</w:t>
-            </w:r>
-          </w:p>
-        </w:tc>
-      </w:tr>
-      <w:tr>
-        <w:tblPrEx>
-          <w:tblCellMar>
-            <w:top w:w="0" w:type="dxa"/>
-            <w:bottom w:w="0" w:type="dxa"/>
-          </w:tblCellMar>
-        </w:tblPrEx>
-        <w:trPr>
-          <w:trHeight w:val="144"/>
-        </w:trPr>
-        <w:tc>
-          <w:tcPr>
-            <w:tcW w:w="2158" w:type="dxa"/>
-            <w:gridSpan w:val="2"/>
-          </w:tcPr>
-          <w:p>
-            <w:pPr>
-              <w:tabs>
-                <w:tab w:val="right" w:pos="1980"/>
-              </w:tabs>
-              <w:rPr>
-                <w:sz w:val="18"/>
-                <w:szCs w:val="18"/>
-              </w:rPr>
-            </w:pPr>
-            <w:r>
-              <w:rPr>
-                <w:sz w:val="18"/>
-                <w:szCs w:val="18"/>
-              </w:rPr>
-              <w:t xml:space="preserve">J8.2  SP-E  spare</w:t>
-            </w:r>
-            <w:r>
-              <w:rPr>
-                <w:sz w:val="18"/>
-                <w:szCs w:val="18"/>
-              </w:rPr>
-              <w:tab/>
-            </w:r>
-            <w:r>
-              <w:rPr>
-                <w:sz w:val="18"/>
-                <w:szCs w:val="18"/>
-              </w:rPr>
-              <w:t xml:space="preserve">(16,36)</w:t>
-            </w:r>
-          </w:p>
-        </w:tc>
-      </w:tr>
-      <w:tr>
-        <w:tblPrEx>
-          <w:tblCellMar>
-            <w:top w:w="0" w:type="dxa"/>
-            <w:bottom w:w="0" w:type="dxa"/>
-          </w:tblCellMar>
-        </w:tblPrEx>
-        <w:trPr>
-          <w:trHeight w:val="144"/>
-        </w:trPr>
-        <w:tc>
-          <w:tcPr>
-            <w:tcW w:w="2158" w:type="dxa"/>
-            <w:gridSpan w:val="2"/>
-          </w:tcPr>
-          <w:p>
-            <w:pPr>
-              <w:tabs>
-                <w:tab w:val="right" w:pos="1980"/>
-              </w:tabs>
-              <w:rPr>
-                <w:sz w:val="18"/>
-                <w:szCs w:val="18"/>
-              </w:rPr>
-            </w:pPr>
-            <w:r>
-              <w:rPr>
-                <w:sz w:val="18"/>
-                <w:szCs w:val="18"/>
-              </w:rPr>
-              <w:t xml:space="preserve">J8.3  COM</w:t>
-            </w:r>
-          </w:p>
-        </w:tc>
-      </w:tr>
-      <w:tr>
-        <w:tblPrEx>
-          <w:tblCellMar>
-            <w:top w:w="0" w:type="dxa"/>
-            <w:bottom w:w="0" w:type="dxa"/>
-          </w:tblCellMar>
-        </w:tblPrEx>
-        <w:trPr>
-          <w:trHeight w:val="144"/>
-        </w:trPr>
-        <w:tc>
-          <w:tcPr>
-            <w:tcW w:w="2158" w:type="dxa"/>
-            <w:gridSpan w:val="2"/>
-          </w:tcPr>
-          <w:p>
-            <w:pPr>
-              <w:tabs>
-                <w:tab w:val="right" w:pos="1980"/>
-              </w:tabs>
-              <w:rPr>
-                <w:sz w:val="18"/>
-                <w:szCs w:val="18"/>
-              </w:rPr>
-            </w:pPr>
-            <w:r>
-              <w:rPr>
-                <w:sz w:val="18"/>
-                <w:szCs w:val="18"/>
-              </w:rPr>
               <w:t xml:space="preserve"> </w:t>
             </w:r>
           </w:p>
@@ -919,77 +814,147 @@
                 <w:sz w:val="18"/>
                 <w:szCs w:val="18"/>
               </w:rPr>
-              <w:t xml:space="preserve">H1  GND·DATA·VCC  trunk</w:t>
-            </w:r>
-          </w:p>
-        </w:tc>
-      </w:tr>
-      <w:tr>
-        <w:tblPrEx>
-          <w:tblCellMar>
-            <w:top w:w="0" w:type="dxa"/>
-            <w:bottom w:w="0" w:type="dxa"/>
-          </w:tblCellMar>
-        </w:tblPrEx>
-        <w:trPr>
-          <w:trHeight w:val="144"/>
-        </w:trPr>
-        <w:tc>
-          <w:tcPr>
-            <w:tcW w:w="2158" w:type="dxa"/>
-            <w:gridSpan w:val="2"/>
-          </w:tcPr>
-          <w:p>
-            <w:pPr>
-              <w:tabs>
-                <w:tab w:val="right" w:pos="1980"/>
-              </w:tabs>
-              <w:rPr>
-                <w:sz w:val="18"/>
-                <w:szCs w:val="18"/>
-              </w:rPr>
-            </w:pPr>
-            <w:r>
-              <w:rPr>
-                <w:sz w:val="18"/>
-                <w:szCs w:val="18"/>
-              </w:rPr>
-              <w:t xml:space="preserve">H2  GND·DATA·VCC  spare</w:t>
-            </w:r>
-          </w:p>
-        </w:tc>
-      </w:tr>
-      <w:tr>
-        <w:tblPrEx>
-          <w:tblCellMar>
-            <w:top w:w="0" w:type="dxa"/>
-            <w:bottom w:w="0" w:type="dxa"/>
-          </w:tblCellMar>
-        </w:tblPrEx>
-        <w:trPr>
-          <w:trHeight w:val="144"/>
-        </w:trPr>
-        <w:tc>
-          <w:tcPr>
-            <w:tcW w:w="2158" w:type="dxa"/>
-            <w:gridSpan w:val="2"/>
-          </w:tcPr>
-          <w:p>
-            <w:pPr>
-              <w:tabs>
-                <w:tab w:val="right" w:pos="1980"/>
-              </w:tabs>
-              <w:rPr>
-                <w:sz w:val="18"/>
-                <w:szCs w:val="18"/>
-              </w:rPr>
-            </w:pPr>
-            <w:r>
-              <w:rPr>
-                <w:sz w:val="18"/>
-                <w:szCs w:val="18"/>
-              </w:rPr>
-              <w:t xml:space="preserve">H3  GND·DATA·VCC  spare</w:t>
+              <w:t xml:space="preserve">EXT J3  24VAC IN  R·C  black</w:t>
+            </w:r>
+          </w:p>
+        </w:tc>
+      </w:tr>
+      <w:tr>
+        <w:tblPrEx>
+          <w:tblCellMar>
+            <w:top w:w="0" w:type="dxa"/>
+            <w:bottom w:w="0" w:type="dxa"/>
+          </w:tblCellMar>
+        </w:tblPrEx>
+        <w:trPr>
+          <w:trHeight w:val="144"/>
+        </w:trPr>
+        <w:tc>
+          <w:tcPr>
+            <w:tcW w:w="2158" w:type="dxa"/>
+            <w:gridSpan w:val="2"/>
+          </w:tcPr>
+          <w:p>
+            <w:pPr>
+              <w:tabs>
+                <w:tab w:val="right" w:pos="1980"/>
+              </w:tabs>
+              <w:rPr>
+                <w:sz w:val="18"/>
+                <w:szCs w:val="18"/>
+              </w:rPr>
+            </w:pPr>
+            <w:r>
+              <w:rPr>
+                <w:sz w:val="18"/>
+                <w:szCs w:val="18"/>
+              </w:rPr>
+              <w:t xml:space="preserve">EXT J4  5VDC to Pi  +5·G  white</w:t>
+            </w:r>
+          </w:p>
+        </w:tc>
+      </w:tr>
+      <w:tr>
+        <w:tblPrEx>
+          <w:tblCellMar>
+            <w:top w:w="0" w:type="dxa"/>
+            <w:bottom w:w="0" w:type="dxa"/>
+          </w:tblCellMar>
+        </w:tblPrEx>
+        <w:trPr>
+          <w:trHeight w:val="144"/>
+        </w:trPr>
+        <w:tc>
+          <w:tcPr>
+            <w:tcW w:w="2158" w:type="dxa"/>
+            <w:gridSpan w:val="2"/>
+          </w:tcPr>
+          <w:p>
+            <w:pPr>
+              <w:tabs>
+                <w:tab w:val="right" w:pos="1980"/>
+              </w:tabs>
+              <w:rPr>
+                <w:sz w:val="18"/>
+                <w:szCs w:val="18"/>
+              </w:rPr>
+            </w:pPr>
+            <w:r>
+              <w:rPr>
+                <w:sz w:val="18"/>
+                <w:szCs w:val="18"/>
+              </w:rPr>
+              <w:t xml:space="preserve"> </w:t>
+            </w:r>
+          </w:p>
+        </w:tc>
+      </w:tr>
+      <w:tr>
+        <w:tblPrEx>
+          <w:tblCellMar>
+            <w:top w:w="0" w:type="dxa"/>
+            <w:bottom w:w="0" w:type="dxa"/>
+          </w:tblCellMar>
+        </w:tblPrEx>
+        <w:trPr>
+          <w:trHeight w:val="144"/>
+        </w:trPr>
+        <w:tc>
+          <w:tcPr>
+            <w:tcW w:w="2158" w:type="dxa"/>
+            <w:gridSpan w:val="2"/>
+          </w:tcPr>
+          <w:p>
+            <w:pPr>
+              <w:tabs>
+                <w:tab w:val="right" w:pos="1980"/>
+              </w:tabs>
+              <w:rPr>
+                <w:sz w:val="18"/>
+                <w:szCs w:val="18"/>
+              </w:rPr>
+            </w:pPr>
+            <w:r>
+              <w:rPr>
+                <w:sz w:val="18"/>
+                <w:szCs w:val="18"/>
+              </w:rPr>
+              <w:t xml:space="preserve">H1  V·D·G  trunk</w:t>
+            </w:r>
+          </w:p>
+        </w:tc>
+      </w:tr>
+      <w:tr>
+        <w:tblPrEx>
+          <w:tblCellMar>
+            <w:top w:w="0" w:type="dxa"/>
+            <w:bottom w:w="0" w:type="dxa"/>
+          </w:tblCellMar>
+        </w:tblPrEx>
+        <w:trPr>
+          <w:trHeight w:val="144"/>
+        </w:trPr>
+        <w:tc>
+          <w:tcPr>
+            <w:tcW w:w="2158" w:type="dxa"/>
+            <w:gridSpan w:val="2"/>
+          </w:tcPr>
+          <w:p>
+            <w:pPr>
+              <w:tabs>
+                <w:tab w:val="right" w:pos="1980"/>
+              </w:tabs>
+              <w:rPr>
+                <w:sz w:val="18"/>
+                <w:szCs w:val="18"/>
+              </w:rPr>
+            </w:pPr>
+            <w:r>
+              <w:rPr>
+                <w:sz w:val="18"/>
+                <w:szCs w:val="18"/>
+              </w:rPr>
+              <w:t xml:space="preserve">H2  V·D·G  spare</w:t>
             </w:r>
           </w:p>
         </w:tc>

</xml_diff>

<commit_message>
Label: shorten the EXT rows so they do not wrap (bk/wh)
Co-Authored-By: Claude Fable 5.1 <noreply@anthropic.com>
</commit_message>
<xml_diff>
--- a/docs/PhoenixContact-BC-RPI-label.docx
+++ b/docs/PhoenixContact-BC-RPI-label.docx
@@ -814,42 +814,42 @@
                 <w:sz w:val="18"/>
                 <w:szCs w:val="18"/>
               </w:rPr>
-              <w:t xml:space="preserve">EXT J3  24VAC IN  R·C  black</w:t>
-            </w:r>
-          </w:p>
-        </w:tc>
-      </w:tr>
-      <w:tr>
-        <w:tblPrEx>
-          <w:tblCellMar>
-            <w:top w:w="0" w:type="dxa"/>
-            <w:bottom w:w="0" w:type="dxa"/>
-          </w:tblCellMar>
-        </w:tblPrEx>
-        <w:trPr>
-          <w:trHeight w:val="144"/>
-        </w:trPr>
-        <w:tc>
-          <w:tcPr>
-            <w:tcW w:w="2158" w:type="dxa"/>
-            <w:gridSpan w:val="2"/>
-          </w:tcPr>
-          <w:p>
-            <w:pPr>
-              <w:tabs>
-                <w:tab w:val="right" w:pos="1980"/>
-              </w:tabs>
-              <w:rPr>
-                <w:sz w:val="18"/>
-                <w:szCs w:val="18"/>
-              </w:rPr>
-            </w:pPr>
-            <w:r>
-              <w:rPr>
-                <w:sz w:val="18"/>
-                <w:szCs w:val="18"/>
-              </w:rPr>
-              <w:t xml:space="preserve">EXT J4  5VDC to Pi  +5·G  white</w:t>
+              <w:t xml:space="preserve">EXT J3  24VAC  R·C  bk</w:t>
+            </w:r>
+          </w:p>
+        </w:tc>
+      </w:tr>
+      <w:tr>
+        <w:tblPrEx>
+          <w:tblCellMar>
+            <w:top w:w="0" w:type="dxa"/>
+            <w:bottom w:w="0" w:type="dxa"/>
+          </w:tblCellMar>
+        </w:tblPrEx>
+        <w:trPr>
+          <w:trHeight w:val="144"/>
+        </w:trPr>
+        <w:tc>
+          <w:tcPr>
+            <w:tcW w:w="2158" w:type="dxa"/>
+            <w:gridSpan w:val="2"/>
+          </w:tcPr>
+          <w:p>
+            <w:pPr>
+              <w:tabs>
+                <w:tab w:val="right" w:pos="1980"/>
+              </w:tabs>
+              <w:rPr>
+                <w:sz w:val="18"/>
+                <w:szCs w:val="18"/>
+              </w:rPr>
+            </w:pPr>
+            <w:r>
+              <w:rPr>
+                <w:sz w:val="18"/>
+                <w:szCs w:val="18"/>
+              </w:rPr>
+              <w:t xml:space="preserve">EXT J4  5V to Pi  +5·G  wh</w:t>
             </w:r>
           </w:p>
         </w:tc>

</xml_diff>

<commit_message>
Label for the rev B INT and rev C EXT boards (#232)
* Label for the rev B INT and rev C EXT boards

J4 carries HPCOOL, DHWX and SP-E; the J8 pigtail rows go; EXT's 24 VAC entry
and 5 V output rows and the two rev C probe sockets replace the H3 row. The
MAC is unchanged: the same Pi moves onto the new boards.

Co-Authored-By: Claude Fable 5.1 <noreply@anthropic.com>

* Label: shorten the EXT rows so they do not wrap (bk/wh)

Co-Authored-By: Claude Fable 5.1 <noreply@anthropic.com>

* Label: EXT J4 row to 23 characters, the width of the longest rev A row

Co-Authored-By: Claude Fable 5.1 <noreply@anthropic.com>

---------

Co-authored-by: Claude Fable 5.1 <noreply@anthropic.com>
</commit_message>
<xml_diff>
--- a/docs/PhoenixContact-BC-RPI-label.docx
+++ b/docs/PhoenixContact-BC-RPI-label.docx
@@ -597,77 +597,7 @@
                 <w:sz w:val="18"/>
                 <w:szCs w:val="18"/>
               </w:rPr>
-              <w:t xml:space="preserve">J4.1  24VAC IN</w:t>
-            </w:r>
-          </w:p>
-        </w:tc>
-      </w:tr>
-      <w:tr>
-        <w:tblPrEx>
-          <w:tblCellMar>
-            <w:top w:w="0" w:type="dxa"/>
-            <w:bottom w:w="0" w:type="dxa"/>
-          </w:tblCellMar>
-        </w:tblPrEx>
-        <w:trPr>
-          <w:trHeight w:val="144"/>
-        </w:trPr>
-        <w:tc>
-          <w:tcPr>
-            <w:tcW w:w="2158" w:type="dxa"/>
-            <w:gridSpan w:val="2"/>
-          </w:tcPr>
-          <w:p>
-            <w:pPr>
-              <w:tabs>
-                <w:tab w:val="right" w:pos="1980"/>
-              </w:tabs>
-              <w:rPr>
-                <w:sz w:val="18"/>
-                <w:szCs w:val="18"/>
-              </w:rPr>
-            </w:pPr>
-            <w:r>
-              <w:rPr>
-                <w:sz w:val="18"/>
-                <w:szCs w:val="18"/>
-              </w:rPr>
-              <w:t xml:space="preserve">J4.2  24VAC IN</w:t>
-            </w:r>
-          </w:p>
-        </w:tc>
-      </w:tr>
-      <w:tr>
-        <w:tblPrEx>
-          <w:tblCellMar>
-            <w:top w:w="0" w:type="dxa"/>
-            <w:bottom w:w="0" w:type="dxa"/>
-          </w:tblCellMar>
-        </w:tblPrEx>
-        <w:trPr>
-          <w:trHeight w:val="144"/>
-        </w:trPr>
-        <w:tc>
-          <w:tcPr>
-            <w:tcW w:w="2158" w:type="dxa"/>
-            <w:gridSpan w:val="2"/>
-          </w:tcPr>
-          <w:p>
-            <w:pPr>
-              <w:tabs>
-                <w:tab w:val="right" w:pos="1980"/>
-              </w:tabs>
-              <w:rPr>
-                <w:sz w:val="18"/>
-                <w:szCs w:val="18"/>
-              </w:rPr>
-            </w:pPr>
-            <w:r>
-              <w:rPr>
-                <w:sz w:val="18"/>
-                <w:szCs w:val="18"/>
-              </w:rPr>
-              <w:t xml:space="preserve">J4.3  DHWX</w:t>
+              <w:t xml:space="preserve">J4.1  HPCOOL</w:t>
             </w:r>
             <w:r>
               <w:rPr>
@@ -681,6 +611,55 @@
                 <w:sz w:val="18"/>
                 <w:szCs w:val="18"/>
               </w:rPr>
+              <w:t xml:space="preserve">(13,33)</w:t>
+            </w:r>
+          </w:p>
+        </w:tc>
+      </w:tr>
+      <w:tr>
+        <w:tblPrEx>
+          <w:tblCellMar>
+            <w:top w:w="0" w:type="dxa"/>
+            <w:bottom w:w="0" w:type="dxa"/>
+          </w:tblCellMar>
+        </w:tblPrEx>
+        <w:trPr>
+          <w:trHeight w:val="144"/>
+        </w:trPr>
+        <w:tc>
+          <w:tcPr>
+            <w:tcW w:w="2158" w:type="dxa"/>
+            <w:gridSpan w:val="2"/>
+          </w:tcPr>
+          <w:p>
+            <w:pPr>
+              <w:tabs>
+                <w:tab w:val="right" w:pos="1980"/>
+              </w:tabs>
+              <w:rPr>
+                <w:sz w:val="18"/>
+                <w:szCs w:val="18"/>
+              </w:rPr>
+            </w:pPr>
+            <w:r>
+              <w:rPr>
+                <w:sz w:val="18"/>
+                <w:szCs w:val="18"/>
+              </w:rPr>
+              <w:t xml:space="preserve">J4.2  DHWX</w:t>
+            </w:r>
+            <w:r>
+              <w:rPr>
+                <w:sz w:val="18"/>
+                <w:szCs w:val="18"/>
+              </w:rPr>
+              <w:tab/>
+            </w:r>
+            <w:r>
+              <w:rPr>
+                <w:sz w:val="18"/>
+                <w:szCs w:val="18"/>
+              </w:rPr>
               <w:t xml:space="preserve">(19,35)</w:t>
             </w:r>
           </w:p>
@@ -716,6 +695,55 @@
                 <w:sz w:val="18"/>
                 <w:szCs w:val="18"/>
               </w:rPr>
+              <w:t xml:space="preserve">J4.3  SP-E  spare</w:t>
+            </w:r>
+            <w:r>
+              <w:rPr>
+                <w:sz w:val="18"/>
+                <w:szCs w:val="18"/>
+              </w:rPr>
+              <w:tab/>
+            </w:r>
+            <w:r>
+              <w:rPr>
+                <w:sz w:val="18"/>
+                <w:szCs w:val="18"/>
+              </w:rPr>
+              <w:t xml:space="preserve">(16,36)</w:t>
+            </w:r>
+          </w:p>
+        </w:tc>
+      </w:tr>
+      <w:tr>
+        <w:tblPrEx>
+          <w:tblCellMar>
+            <w:top w:w="0" w:type="dxa"/>
+            <w:bottom w:w="0" w:type="dxa"/>
+          </w:tblCellMar>
+        </w:tblPrEx>
+        <w:trPr>
+          <w:trHeight w:val="144"/>
+        </w:trPr>
+        <w:tc>
+          <w:tcPr>
+            <w:tcW w:w="2158" w:type="dxa"/>
+            <w:gridSpan w:val="2"/>
+          </w:tcPr>
+          <w:p>
+            <w:pPr>
+              <w:tabs>
+                <w:tab w:val="right" w:pos="1980"/>
+              </w:tabs>
+              <w:rPr>
+                <w:sz w:val="18"/>
+                <w:szCs w:val="18"/>
+              </w:rPr>
+            </w:pPr>
+            <w:r>
+              <w:rPr>
+                <w:sz w:val="18"/>
+                <w:szCs w:val="18"/>
+              </w:rPr>
               <w:t xml:space="preserve">J4.4  COM</w:t>
             </w:r>
           </w:p>
@@ -751,139 +779,6 @@
                 <w:sz w:val="18"/>
                 <w:szCs w:val="18"/>
               </w:rPr>
-              <w:t xml:space="preserve">J8.1  HPCOOL</w:t>
-            </w:r>
-            <w:r>
-              <w:rPr>
-                <w:sz w:val="18"/>
-                <w:szCs w:val="18"/>
-              </w:rPr>
-              <w:tab/>
-            </w:r>
-            <w:r>
-              <w:rPr>
-                <w:sz w:val="18"/>
-                <w:szCs w:val="18"/>
-              </w:rPr>
-              <w:t xml:space="preserve">(13,33)</w:t>
-            </w:r>
-          </w:p>
-        </w:tc>
-      </w:tr>
-      <w:tr>
-        <w:tblPrEx>
-          <w:tblCellMar>
-            <w:top w:w="0" w:type="dxa"/>
-            <w:bottom w:w="0" w:type="dxa"/>
-          </w:tblCellMar>
-        </w:tblPrEx>
-        <w:trPr>
-          <w:trHeight w:val="144"/>
-        </w:trPr>
-        <w:tc>
-          <w:tcPr>
-            <w:tcW w:w="2158" w:type="dxa"/>
-            <w:gridSpan w:val="2"/>
-          </w:tcPr>
-          <w:p>
-            <w:pPr>
-              <w:tabs>
-                <w:tab w:val="right" w:pos="1980"/>
-              </w:tabs>
-              <w:rPr>
-                <w:sz w:val="18"/>
-                <w:szCs w:val="18"/>
-              </w:rPr>
-            </w:pPr>
-            <w:r>
-              <w:rPr>
-                <w:sz w:val="18"/>
-                <w:szCs w:val="18"/>
-              </w:rPr>
-              <w:t xml:space="preserve">J8.2  SP-E  spare</w:t>
-            </w:r>
-            <w:r>
-              <w:rPr>
-                <w:sz w:val="18"/>
-                <w:szCs w:val="18"/>
-              </w:rPr>
-              <w:tab/>
-            </w:r>
-            <w:r>
-              <w:rPr>
-                <w:sz w:val="18"/>
-                <w:szCs w:val="18"/>
-              </w:rPr>
-              <w:t xml:space="preserve">(16,36)</w:t>
-            </w:r>
-          </w:p>
-        </w:tc>
-      </w:tr>
-      <w:tr>
-        <w:tblPrEx>
-          <w:tblCellMar>
-            <w:top w:w="0" w:type="dxa"/>
-            <w:bottom w:w="0" w:type="dxa"/>
-          </w:tblCellMar>
-        </w:tblPrEx>
-        <w:trPr>
-          <w:trHeight w:val="144"/>
-        </w:trPr>
-        <w:tc>
-          <w:tcPr>
-            <w:tcW w:w="2158" w:type="dxa"/>
-            <w:gridSpan w:val="2"/>
-          </w:tcPr>
-          <w:p>
-            <w:pPr>
-              <w:tabs>
-                <w:tab w:val="right" w:pos="1980"/>
-              </w:tabs>
-              <w:rPr>
-                <w:sz w:val="18"/>
-                <w:szCs w:val="18"/>
-              </w:rPr>
-            </w:pPr>
-            <w:r>
-              <w:rPr>
-                <w:sz w:val="18"/>
-                <w:szCs w:val="18"/>
-              </w:rPr>
-              <w:t xml:space="preserve">J8.3  COM</w:t>
-            </w:r>
-          </w:p>
-        </w:tc>
-      </w:tr>
-      <w:tr>
-        <w:tblPrEx>
-          <w:tblCellMar>
-            <w:top w:w="0" w:type="dxa"/>
-            <w:bottom w:w="0" w:type="dxa"/>
-          </w:tblCellMar>
-        </w:tblPrEx>
-        <w:trPr>
-          <w:trHeight w:val="144"/>
-        </w:trPr>
-        <w:tc>
-          <w:tcPr>
-            <w:tcW w:w="2158" w:type="dxa"/>
-            <w:gridSpan w:val="2"/>
-          </w:tcPr>
-          <w:p>
-            <w:pPr>
-              <w:tabs>
-                <w:tab w:val="right" w:pos="1980"/>
-              </w:tabs>
-              <w:rPr>
-                <w:sz w:val="18"/>
-                <w:szCs w:val="18"/>
-              </w:rPr>
-            </w:pPr>
-            <w:r>
-              <w:rPr>
-                <w:sz w:val="18"/>
-                <w:szCs w:val="18"/>
-              </w:rPr>
               <w:t xml:space="preserve"> </w:t>
             </w:r>
           </w:p>
@@ -919,77 +814,147 @@
                 <w:sz w:val="18"/>
                 <w:szCs w:val="18"/>
               </w:rPr>
-              <w:t xml:space="preserve">H1  GND·DATA·VCC  trunk</w:t>
-            </w:r>
-          </w:p>
-        </w:tc>
-      </w:tr>
-      <w:tr>
-        <w:tblPrEx>
-          <w:tblCellMar>
-            <w:top w:w="0" w:type="dxa"/>
-            <w:bottom w:w="0" w:type="dxa"/>
-          </w:tblCellMar>
-        </w:tblPrEx>
-        <w:trPr>
-          <w:trHeight w:val="144"/>
-        </w:trPr>
-        <w:tc>
-          <w:tcPr>
-            <w:tcW w:w="2158" w:type="dxa"/>
-            <w:gridSpan w:val="2"/>
-          </w:tcPr>
-          <w:p>
-            <w:pPr>
-              <w:tabs>
-                <w:tab w:val="right" w:pos="1980"/>
-              </w:tabs>
-              <w:rPr>
-                <w:sz w:val="18"/>
-                <w:szCs w:val="18"/>
-              </w:rPr>
-            </w:pPr>
-            <w:r>
-              <w:rPr>
-                <w:sz w:val="18"/>
-                <w:szCs w:val="18"/>
-              </w:rPr>
-              <w:t xml:space="preserve">H2  GND·DATA·VCC  spare</w:t>
-            </w:r>
-          </w:p>
-        </w:tc>
-      </w:tr>
-      <w:tr>
-        <w:tblPrEx>
-          <w:tblCellMar>
-            <w:top w:w="0" w:type="dxa"/>
-            <w:bottom w:w="0" w:type="dxa"/>
-          </w:tblCellMar>
-        </w:tblPrEx>
-        <w:trPr>
-          <w:trHeight w:val="144"/>
-        </w:trPr>
-        <w:tc>
-          <w:tcPr>
-            <w:tcW w:w="2158" w:type="dxa"/>
-            <w:gridSpan w:val="2"/>
-          </w:tcPr>
-          <w:p>
-            <w:pPr>
-              <w:tabs>
-                <w:tab w:val="right" w:pos="1980"/>
-              </w:tabs>
-              <w:rPr>
-                <w:sz w:val="18"/>
-                <w:szCs w:val="18"/>
-              </w:rPr>
-            </w:pPr>
-            <w:r>
-              <w:rPr>
-                <w:sz w:val="18"/>
-                <w:szCs w:val="18"/>
-              </w:rPr>
-              <w:t xml:space="preserve">H3  GND·DATA·VCC  spare</w:t>
+              <w:t xml:space="preserve">EXT J3  24VAC  R·C  bk</w:t>
+            </w:r>
+          </w:p>
+        </w:tc>
+      </w:tr>
+      <w:tr>
+        <w:tblPrEx>
+          <w:tblCellMar>
+            <w:top w:w="0" w:type="dxa"/>
+            <w:bottom w:w="0" w:type="dxa"/>
+          </w:tblCellMar>
+        </w:tblPrEx>
+        <w:trPr>
+          <w:trHeight w:val="144"/>
+        </w:trPr>
+        <w:tc>
+          <w:tcPr>
+            <w:tcW w:w="2158" w:type="dxa"/>
+            <w:gridSpan w:val="2"/>
+          </w:tcPr>
+          <w:p>
+            <w:pPr>
+              <w:tabs>
+                <w:tab w:val="right" w:pos="1980"/>
+              </w:tabs>
+              <w:rPr>
+                <w:sz w:val="18"/>
+                <w:szCs w:val="18"/>
+              </w:rPr>
+            </w:pPr>
+            <w:r>
+              <w:rPr>
+                <w:sz w:val="18"/>
+                <w:szCs w:val="18"/>
+              </w:rPr>
+              <w:t xml:space="preserve">EXT J4  5V Pi  +5·G  wh</w:t>
+            </w:r>
+          </w:p>
+        </w:tc>
+      </w:tr>
+      <w:tr>
+        <w:tblPrEx>
+          <w:tblCellMar>
+            <w:top w:w="0" w:type="dxa"/>
+            <w:bottom w:w="0" w:type="dxa"/>
+          </w:tblCellMar>
+        </w:tblPrEx>
+        <w:trPr>
+          <w:trHeight w:val="144"/>
+        </w:trPr>
+        <w:tc>
+          <w:tcPr>
+            <w:tcW w:w="2158" w:type="dxa"/>
+            <w:gridSpan w:val="2"/>
+          </w:tcPr>
+          <w:p>
+            <w:pPr>
+              <w:tabs>
+                <w:tab w:val="right" w:pos="1980"/>
+              </w:tabs>
+              <w:rPr>
+                <w:sz w:val="18"/>
+                <w:szCs w:val="18"/>
+              </w:rPr>
+            </w:pPr>
+            <w:r>
+              <w:rPr>
+                <w:sz w:val="18"/>
+                <w:szCs w:val="18"/>
+              </w:rPr>
+              <w:t xml:space="preserve"> </w:t>
+            </w:r>
+          </w:p>
+        </w:tc>
+      </w:tr>
+      <w:tr>
+        <w:tblPrEx>
+          <w:tblCellMar>
+            <w:top w:w="0" w:type="dxa"/>
+            <w:bottom w:w="0" w:type="dxa"/>
+          </w:tblCellMar>
+        </w:tblPrEx>
+        <w:trPr>
+          <w:trHeight w:val="144"/>
+        </w:trPr>
+        <w:tc>
+          <w:tcPr>
+            <w:tcW w:w="2158" w:type="dxa"/>
+            <w:gridSpan w:val="2"/>
+          </w:tcPr>
+          <w:p>
+            <w:pPr>
+              <w:tabs>
+                <w:tab w:val="right" w:pos="1980"/>
+              </w:tabs>
+              <w:rPr>
+                <w:sz w:val="18"/>
+                <w:szCs w:val="18"/>
+              </w:rPr>
+            </w:pPr>
+            <w:r>
+              <w:rPr>
+                <w:sz w:val="18"/>
+                <w:szCs w:val="18"/>
+              </w:rPr>
+              <w:t xml:space="preserve">H1  V·D·G  trunk</w:t>
+            </w:r>
+          </w:p>
+        </w:tc>
+      </w:tr>
+      <w:tr>
+        <w:tblPrEx>
+          <w:tblCellMar>
+            <w:top w:w="0" w:type="dxa"/>
+            <w:bottom w:w="0" w:type="dxa"/>
+          </w:tblCellMar>
+        </w:tblPrEx>
+        <w:trPr>
+          <w:trHeight w:val="144"/>
+        </w:trPr>
+        <w:tc>
+          <w:tcPr>
+            <w:tcW w:w="2158" w:type="dxa"/>
+            <w:gridSpan w:val="2"/>
+          </w:tcPr>
+          <w:p>
+            <w:pPr>
+              <w:tabs>
+                <w:tab w:val="right" w:pos="1980"/>
+              </w:tabs>
+              <w:rPr>
+                <w:sz w:val="18"/>
+                <w:szCs w:val="18"/>
+              </w:rPr>
+            </w:pPr>
+            <w:r>
+              <w:rPr>
+                <w:sz w:val="18"/>
+                <w:szCs w:val="18"/>
+              </w:rPr>
+              <w:t xml:space="preserve">H2  V·D·G  spare</w:t>
             </w:r>
           </w:p>
         </w:tc>

</xml_diff>